<commit_message>
Week2 implement core agent graph memory and sql tool
</commit_message>
<xml_diff>
--- a/PRD.docx
+++ b/PRD.docx
@@ -1312,12 +1312,6 @@
             <w:insideH w:val="single" w:color="auto" w:sz="4" w:space="0"/>
             <w:insideV w:val="single" w:color="auto" w:sz="4" w:space="0"/>
           </w:tblBorders>
-          <w:tblCellMar>
-            <w:top w:w="0" w:type="dxa"/>
-            <w:left w:w="108" w:type="dxa"/>
-            <w:bottom w:w="0" w:type="dxa"/>
-            <w:right w:w="108" w:type="dxa"/>
-          </w:tblCellMar>
         </w:tblPrEx>
         <w:trPr>
           <w:jc w:val="center"/>
@@ -2284,12 +2278,6 @@
             <w:insideH w:val="single" w:color="auto" w:sz="4" w:space="0"/>
             <w:insideV w:val="single" w:color="auto" w:sz="4" w:space="0"/>
           </w:tblBorders>
-          <w:tblCellMar>
-            <w:top w:w="0" w:type="dxa"/>
-            <w:left w:w="108" w:type="dxa"/>
-            <w:bottom w:w="0" w:type="dxa"/>
-            <w:right w:w="108" w:type="dxa"/>
-          </w:tblCellMar>
         </w:tblPrEx>
         <w:trPr>
           <w:jc w:val="center"/>
@@ -6281,18 +6269,6 @@
     </w:p>
     <w:p>
       <w:pPr>
-        <w:spacing w:after="120" w:line="276" w:lineRule="auto"/>
-      </w:pPr>
-      <w:r>
-        <w:rPr>
-          <w:rFonts w:ascii="微软雅黑" w:hAnsi="微软雅黑" w:eastAsia="微软雅黑"/>
-          <w:sz w:val="21"/>
-        </w:rPr>
-        <w:t>暂不纳入 MVP 的内容：复杂权限审批、完整图表系统、企业级数据血缘、复杂预测模型、多 Agent 协同自动调度。</w:t>
-      </w:r>
-    </w:p>
-    <w:p>
-      <w:pPr>
         <w:pStyle w:val="3"/>
       </w:pPr>
       <w:r>
@@ -7716,39 +7692,8 @@
     </w:p>
     <w:p>
       <w:pPr>
-        <w:pStyle w:val="3"/>
-      </w:pPr>
-      <w:r>
-        <w:rPr>
-          <w:rFonts w:ascii="微软雅黑" w:hAnsi="微软雅黑" w:eastAsia="微软雅黑"/>
-          <w:color w:val="1F4E79"/>
-        </w:rPr>
-        <w:t>21. 项目简历表达建议</w:t>
-      </w:r>
-    </w:p>
-    <w:p>
-      <w:pPr>
         <w:spacing w:after="120" w:line="276" w:lineRule="auto"/>
       </w:pPr>
-      <w:r>
-        <w:rPr>
-          <w:rFonts w:ascii="微软雅黑" w:hAnsi="微软雅黑" w:eastAsia="微软雅黑"/>
-          <w:sz w:val="21"/>
-        </w:rPr>
-        <w:t>本项目可在简历中描述为：</w:t>
-      </w:r>
-    </w:p>
-    <w:p>
-      <w:pPr>
-        <w:spacing w:after="120" w:line="276" w:lineRule="auto"/>
-      </w:pPr>
-      <w:r>
-        <w:rPr>
-          <w:rFonts w:ascii="微软雅黑" w:hAnsi="微软雅黑" w:eastAsia="微软雅黑"/>
-          <w:sz w:val="21"/>
-        </w:rPr>
-        <w:t>构建面向电商运营场景的 Data Agent，支持业务人员通过自然语言查询核心经营指标。系统结合指标语义层、Schema RAG、SQL 自动生成、安全校验、多轮上下文管理和报告生成能力，实现从自然语言问题到 SQL 查询、数据分析解释和结构化报告输出的完整链路。</w:t>
-      </w:r>
       <w:bookmarkStart w:id="0" w:name="_GoBack"/>
       <w:bookmarkEnd w:id="0"/>
     </w:p>

</xml_diff>